<commit_message>
Rebuild Word letterhead without logo (clean text-only header)
</commit_message>
<xml_diff>
--- a/crownest-letterhead.docx
+++ b/crownest-letterhead.docx
@@ -292,61 +292,13 @@
       <w:tblLook w:firstColumn="1" w:firstRow="1" w:lastColumn="0" w:lastRow="0" w:noHBand="0" w:noVBand="1" w:val="04A0"/>
     </w:tblPr>
     <w:tblGrid>
-      <w:gridCol w:w="1584"/>
-      <w:gridCol w:w="5616"/>
-      <w:gridCol w:w="2448"/>
+      <w:gridCol w:w="7056"/>
+      <w:gridCol w:w="2592"/>
     </w:tblGrid>
     <w:tr>
       <w:tc>
         <w:tcPr>
-          <w:tcW w:type="dxa" w:w="1584"/>
-          <w:tcBorders>
-            <w:bottom w:val="single" w:sz="18" w:space="0" w:color="6B1F2A"/>
-          </w:tcBorders>
-        </w:tcPr>
-        <w:p>
-          <w:pPr>
-            <w:jc w:val="left"/>
-          </w:pPr>
-          <w:r>
-            <w:drawing>
-              <wp:inline xmlns:a="http://schemas.openxmlformats.org/drawingml/2006/main" xmlns:pic="http://schemas.openxmlformats.org/drawingml/2006/picture">
-                <wp:extent cx="868680" cy="868680"/>
-                <wp:docPr id="1" name="Picture 1"/>
-                <wp:cNvGraphicFramePr>
-                  <a:graphicFrameLocks noChangeAspect="1"/>
-                </wp:cNvGraphicFramePr>
-                <a:graphic>
-                  <a:graphicData uri="http://schemas.openxmlformats.org/drawingml/2006/picture">
-                    <pic:pic>
-                      <pic:nvPicPr>
-                        <pic:cNvPr id="0" name="crownest-crest.png"/>
-                        <pic:cNvPicPr/>
-                      </pic:nvPicPr>
-                      <pic:blipFill>
-                        <a:blip r:embed="rId1"/>
-                        <a:stretch>
-                          <a:fillRect/>
-                        </a:stretch>
-                      </pic:blipFill>
-                      <pic:spPr>
-                        <a:xfrm>
-                          <a:off x="0" y="0"/>
-                          <a:ext cx="868680" cy="868680"/>
-                        </a:xfrm>
-                        <a:prstGeom prst="rect"/>
-                      </pic:spPr>
-                    </pic:pic>
-                  </a:graphicData>
-                </a:graphic>
-              </wp:inline>
-            </w:drawing>
-          </w:r>
-        </w:p>
-      </w:tc>
-      <w:tc>
-        <w:tcPr>
-          <w:tcW w:type="dxa" w:w="5616"/>
+          <w:tcW w:type="dxa" w:w="7056"/>
           <w:tcBorders>
             <w:bottom w:val="single" w:sz="18" w:space="0" w:color="6B1F2A"/>
           </w:tcBorders>
@@ -396,7 +348,7 @@
       </w:tc>
       <w:tc>
         <w:tcPr>
-          <w:tcW w:type="dxa" w:w="2448"/>
+          <w:tcW w:type="dxa" w:w="2592"/>
           <w:tcBorders>
             <w:bottom w:val="single" w:sz="18" w:space="0" w:color="6B1F2A"/>
           </w:tcBorders>

</xml_diff>